<commit_message>
PLT-430 Document Upload with Category and Validation Included (#446)
* PLT-430 Document Upload with Category and Validation Included

* PLT-430 Document Upload with Category and Validation Included - review fix

* PLT-430 Document Upload with Category and Validation Included - review fix
</commit_message>
<xml_diff>
--- a/src/test/resources/testdata/PD1_example.docx
+++ b/src/test/resources/testdata/PD1_example.docx
@@ -34,23 +34,7 @@
           <w:sz w:val="20"/>
           <w:szCs w:val="20"/>
         </w:rPr>
-        <w:t xml:space="preserve">To: </w:t>
-      </w:r>
-      <w:r>
-        <w:rPr>
-          <w:rFonts w:ascii="Tahoma" w:eastAsia="Tahoma" w:hAnsi="Tahoma" w:cs="Tahoma"/>
-          <w:sz w:val="20"/>
-          <w:szCs w:val="20"/>
-        </w:rPr>
-        <w:t>R</w:t>
-      </w:r>
-      <w:r>
-        <w:rPr>
-          <w:rFonts w:ascii="Tahoma" w:eastAsia="Tahoma" w:hAnsi="Tahoma" w:cs="Tahoma"/>
-          <w:sz w:val="20"/>
-          <w:szCs w:val="20"/>
-        </w:rPr>
-        <w:t xml:space="preserve">E </w:t>
+        <w:t xml:space="preserve">To: RE </w:t>
       </w:r>
       <w:proofErr w:type="spellStart"/>
       <w:r>
@@ -85,39 +69,7 @@
           <w:szCs w:val="20"/>
         </w:rPr>
         <w:tab/>
-        <w:t xml:space="preserve">From: </w:t>
-      </w:r>
-      <w:r>
-        <w:rPr>
-          <w:rFonts w:ascii="Tahoma" w:eastAsia="Tahoma" w:hAnsi="Tahoma" w:cs="Tahoma"/>
-          <w:sz w:val="20"/>
-          <w:szCs w:val="20"/>
-        </w:rPr>
-        <w:t>A.N</w:t>
-      </w:r>
-      <w:r>
-        <w:rPr>
-          <w:rFonts w:ascii="Tahoma" w:eastAsia="Tahoma" w:hAnsi="Tahoma" w:cs="Tahoma"/>
-          <w:sz w:val="20"/>
-          <w:szCs w:val="20"/>
-        </w:rPr>
-        <w:t xml:space="preserve"> </w:t>
-      </w:r>
-      <w:r>
-        <w:rPr>
-          <w:rFonts w:ascii="Tahoma" w:eastAsia="Tahoma" w:hAnsi="Tahoma" w:cs="Tahoma"/>
-          <w:sz w:val="20"/>
-          <w:szCs w:val="20"/>
-        </w:rPr>
-        <w:t>Other</w:t>
-      </w:r>
-      <w:r>
-        <w:rPr>
-          <w:rFonts w:ascii="Tahoma" w:eastAsia="Tahoma" w:hAnsi="Tahoma" w:cs="Tahoma"/>
-          <w:sz w:val="20"/>
-          <w:szCs w:val="20"/>
-        </w:rPr>
-        <w:t xml:space="preserve"> </w:t>
+        <w:t xml:space="preserve">From: A.N Other </w:t>
       </w:r>
       <w:r>
         <w:rPr>
@@ -152,47 +104,7 @@
           <w:szCs w:val="20"/>
         </w:rPr>
         <w:tab/>
-        <w:t xml:space="preserve">HMP &amp; YOI </w:t>
-      </w:r>
-      <w:r>
-        <w:rPr>
-          <w:rFonts w:ascii="Tahoma" w:eastAsia="Tahoma" w:hAnsi="Tahoma" w:cs="Tahoma"/>
-          <w:sz w:val="20"/>
-          <w:szCs w:val="20"/>
-        </w:rPr>
-        <w:t>Somewhere</w:t>
-      </w:r>
-      <w:r>
-        <w:rPr>
-          <w:rFonts w:ascii="Tahoma" w:eastAsia="Tahoma" w:hAnsi="Tahoma" w:cs="Tahoma"/>
-          <w:sz w:val="20"/>
-          <w:szCs w:val="20"/>
-        </w:rPr>
-        <w:t xml:space="preserve">, </w:t>
-      </w:r>
-      <w:r>
-        <w:rPr>
-          <w:rFonts w:ascii="Tahoma" w:eastAsia="Tahoma" w:hAnsi="Tahoma" w:cs="Tahoma"/>
-          <w:sz w:val="20"/>
-          <w:szCs w:val="20"/>
-        </w:rPr>
-        <w:t>Anywhere</w:t>
-      </w:r>
-      <w:r>
-        <w:rPr>
-          <w:rFonts w:ascii="Tahoma" w:eastAsia="Tahoma" w:hAnsi="Tahoma" w:cs="Tahoma"/>
-          <w:sz w:val="20"/>
-          <w:szCs w:val="20"/>
-        </w:rPr>
-        <w:t xml:space="preserve">, </w:t>
-      </w:r>
-      <w:r>
-        <w:rPr>
-          <w:rFonts w:ascii="Tahoma" w:eastAsia="Tahoma" w:hAnsi="Tahoma" w:cs="Tahoma"/>
-          <w:sz w:val="20"/>
-          <w:szCs w:val="20"/>
-        </w:rPr>
-        <w:t xml:space="preserve">Over </w:t>
+        <w:t xml:space="preserve">HMP &amp; YOI Somewhere, Anywhere, Over </w:t>
       </w:r>
       <w:proofErr w:type="gramStart"/>
       <w:r>
@@ -210,39 +122,7 @@
           <w:sz w:val="20"/>
           <w:szCs w:val="20"/>
         </w:rPr>
-        <w:t xml:space="preserve"> Rainbow</w:t>
-      </w:r>
-      <w:r>
-        <w:rPr>
-          <w:rFonts w:ascii="Tahoma" w:eastAsia="Tahoma" w:hAnsi="Tahoma" w:cs="Tahoma"/>
-          <w:sz w:val="20"/>
-          <w:szCs w:val="20"/>
-        </w:rPr>
-        <w:t xml:space="preserve">, </w:t>
-      </w:r>
-      <w:r>
-        <w:rPr>
-          <w:rFonts w:ascii="Tahoma" w:eastAsia="Tahoma" w:hAnsi="Tahoma" w:cs="Tahoma"/>
-          <w:sz w:val="20"/>
-          <w:szCs w:val="20"/>
-        </w:rPr>
-        <w:t>ZZ1</w:t>
-      </w:r>
-      <w:r>
-        <w:rPr>
-          <w:rFonts w:ascii="Tahoma" w:eastAsia="Tahoma" w:hAnsi="Tahoma" w:cs="Tahoma"/>
-          <w:sz w:val="20"/>
-          <w:szCs w:val="20"/>
-        </w:rPr>
-        <w:t xml:space="preserve"> </w:t>
-      </w:r>
-      <w:r>
-        <w:rPr>
-          <w:rFonts w:ascii="Tahoma" w:eastAsia="Tahoma" w:hAnsi="Tahoma" w:cs="Tahoma"/>
-          <w:sz w:val="20"/>
-          <w:szCs w:val="20"/>
-        </w:rPr>
-        <w:t>ZZZ</w:t>
+        <w:t xml:space="preserve"> Rainbow, ZZ1 ZZZ</w:t>
       </w:r>
     </w:p>
     <w:p>
@@ -269,31 +149,7 @@
           <w:szCs w:val="20"/>
         </w:rPr>
         <w:tab/>
-        <w:t>0</w:t>
-      </w:r>
-      <w:r>
-        <w:rPr>
-          <w:rFonts w:ascii="Tahoma" w:eastAsia="Tahoma" w:hAnsi="Tahoma" w:cs="Tahoma"/>
-          <w:sz w:val="20"/>
-          <w:szCs w:val="20"/>
-        </w:rPr>
-        <w:t>1111</w:t>
-      </w:r>
-      <w:r>
-        <w:rPr>
-          <w:rFonts w:ascii="Tahoma" w:eastAsia="Tahoma" w:hAnsi="Tahoma" w:cs="Tahoma"/>
-          <w:sz w:val="20"/>
-          <w:szCs w:val="20"/>
-        </w:rPr>
-        <w:t xml:space="preserve"> </w:t>
-      </w:r>
-      <w:r>
-        <w:rPr>
-          <w:rFonts w:ascii="Tahoma" w:eastAsia="Tahoma" w:hAnsi="Tahoma" w:cs="Tahoma"/>
-          <w:sz w:val="20"/>
-          <w:szCs w:val="20"/>
-        </w:rPr>
-        <w:t>12345678</w:t>
+        <w:t>01111 12345678</w:t>
       </w:r>
     </w:p>
     <w:p>
@@ -328,22 +184,7 @@
           <w:szCs w:val="20"/>
         </w:rPr>
         <w:tab/>
-      </w:r>
-      <w:r>
-        <w:rPr>
-          <w:rFonts w:ascii="Tahoma" w:eastAsia="Tahoma" w:hAnsi="Tahoma" w:cs="Tahoma"/>
-          <w:sz w:val="20"/>
-          <w:szCs w:val="20"/>
-        </w:rPr>
-        <w:t>some.email</w:t>
-      </w:r>
-      <w:r>
-        <w:rPr>
-          <w:rFonts w:ascii="Tahoma" w:eastAsia="Tahoma" w:hAnsi="Tahoma" w:cs="Tahoma"/>
-          <w:sz w:val="20"/>
-          <w:szCs w:val="20"/>
-        </w:rPr>
-        <w:t>@justice.gov.uk</w:t>
+        <w:t>some.email@justice.gov.uk</w:t>
       </w:r>
     </w:p>
     <w:p>
@@ -747,14 +588,7 @@
           <w:rFonts w:ascii="Tahoma" w:eastAsia="Tahoma" w:hAnsi="Tahoma" w:cs="Tahoma"/>
           <w:b/>
         </w:rPr>
-        <w:t xml:space="preserve">NAME: </w:t>
-      </w:r>
-      <w:r>
-        <w:rPr>
-          <w:rFonts w:ascii="Tahoma" w:eastAsia="Tahoma" w:hAnsi="Tahoma" w:cs="Tahoma"/>
-          <w:b/>
-        </w:rPr>
-        <w:t xml:space="preserve">RE </w:t>
+        <w:t xml:space="preserve">NAME: RE </w:t>
       </w:r>
       <w:proofErr w:type="spellStart"/>
       <w:r>
@@ -779,28 +613,7 @@
           <w:rFonts w:ascii="Tahoma" w:eastAsia="Tahoma" w:hAnsi="Tahoma" w:cs="Tahoma"/>
           <w:b/>
         </w:rPr>
-        <w:t xml:space="preserve">ADDRESS:10 </w:t>
-      </w:r>
-      <w:r>
-        <w:rPr>
-          <w:rFonts w:ascii="Tahoma" w:eastAsia="Tahoma" w:hAnsi="Tahoma" w:cs="Tahoma"/>
-          <w:b/>
-        </w:rPr>
-        <w:t>Some Street, A Town</w:t>
-      </w:r>
-      <w:r>
-        <w:rPr>
-          <w:rFonts w:ascii="Tahoma" w:eastAsia="Tahoma" w:hAnsi="Tahoma" w:cs="Tahoma"/>
-          <w:b/>
-        </w:rPr>
-        <w:t xml:space="preserve"> </w:t>
-      </w:r>
-      <w:r>
-        <w:rPr>
-          <w:rFonts w:ascii="Tahoma" w:eastAsia="Tahoma" w:hAnsi="Tahoma" w:cs="Tahoma"/>
-          <w:b/>
-        </w:rPr>
-        <w:t>ZS2 SHK</w:t>
+        <w:t>ADDRESS:10 Some Street, A Town ZS2 SHK</w:t>
       </w:r>
     </w:p>
     <w:p>
@@ -895,14 +708,7 @@
           <w:b/>
         </w:rPr>
         <w:tab/>
-        <w:t>TIME:            11        SIGNED:</w:t>
-      </w:r>
-      <w:r>
-        <w:rPr>
-          <w:rFonts w:ascii="Tahoma" w:eastAsia="Tahoma" w:hAnsi="Tahoma" w:cs="Tahoma"/>
-          <w:b/>
-        </w:rPr>
-        <w:t xml:space="preserve">RE </w:t>
+        <w:t xml:space="preserve">TIME:            11        SIGNED:RE </w:t>
       </w:r>
       <w:proofErr w:type="spellStart"/>
       <w:r>
@@ -961,7 +767,6 @@
     </w:p>
     <w:tbl>
       <w:tblPr>
-        <w:tblStyle w:val="a"/>
         <w:tblW w:w="10456" w:type="dxa"/>
         <w:tblBorders>
           <w:top w:val="single" w:sz="4" w:space="0" w:color="000000"/>
@@ -1292,7 +1097,6 @@
                 <w:b/>
                 <w:i/>
               </w:rPr>
-              <w:lastRenderedPageBreak/>
               <w:t>(can also be used as a PSS condition – drug appointment)</w:t>
             </w:r>
           </w:p>
@@ -1917,6 +1721,7 @@
               <w:rPr>
                 <w:b/>
               </w:rPr>
+              <w:lastRenderedPageBreak/>
               <w:t>5. Possession, ownership, control or inspection of specified items or documents.</w:t>
             </w:r>
           </w:p>
@@ -2078,11 +1883,7 @@
               </w:rPr>
             </w:pPr>
             <w:r>
-              <w:t xml:space="preserve">(d) To make any device capable of making or storing digital images (including a camera and a mobile phone </w:t>
-            </w:r>
-            <w:r>
-              <w:lastRenderedPageBreak/>
-              <w:t>with a camera function) available for inspection upon request.</w:t>
+              <w:t>(d) To make any device capable of making or storing digital images (including a camera and a mobile phone with a camera function) available for inspection upon request.</w:t>
             </w:r>
           </w:p>
         </w:tc>
@@ -3102,7 +2903,11 @@
             </w:r>
             <w:proofErr w:type="gramStart"/>
             <w:r>
-              <w:t>on a monthly basis</w:t>
+              <w:t xml:space="preserve">on a </w:t>
+            </w:r>
+            <w:r>
+              <w:lastRenderedPageBreak/>
+              <w:t>monthly basis</w:t>
             </w:r>
             <w:proofErr w:type="gramEnd"/>
             <w:r>
@@ -3443,7 +3248,6 @@
               <w:rPr>
                 <w:b/>
               </w:rPr>
-              <w:lastRenderedPageBreak/>
               <w:t xml:space="preserve">13. Drug Testing </w:t>
             </w:r>
             <w:r>
@@ -3538,7 +3342,11 @@
               </w:rPr>
             </w:pPr>
             <w:r>
-              <w:t xml:space="preserve">(a) Allow person(s) as designated by your supervising officer to install an electronic monitoring tag on you and access to install any associated equipment in your property, and for the purpose of ensuring that equipment is functioning correctly. You must not damage or tamper with these devices and ensure that the tag is charged, and report to your supervising officer and the EM provider immediately if the tag or the associated equipment are not working correctly. This will be for the purpose of monitoring your </w:t>
+              <w:t xml:space="preserve">(a) Allow person(s) as designated by your supervising officer to install an electronic monitoring tag on you and access to install any associated equipment in your property, and for the purpose of ensuring that equipment is functioning correctly. You must not damage or tamper with these devices and ensure that the tag is charged, and report to your supervising officer and the EM provider immediately if the tag or </w:t>
+            </w:r>
+            <w:r>
+              <w:lastRenderedPageBreak/>
+              <w:t xml:space="preserve">the associated equipment are not working correctly. This will be for the purpose of monitoring your </w:t>
             </w:r>
             <w:r>
               <w:rPr>
@@ -3569,6 +3377,7 @@
                 <w:sz w:val="20"/>
                 <w:szCs w:val="20"/>
               </w:rPr>
+              <w:lastRenderedPageBreak/>
               <w:t>x</w:t>
             </w:r>
           </w:p>
@@ -3909,6 +3718,7 @@
         <w:tab/>
       </w:r>
     </w:p>
+    <w:p/>
     <w:sectPr>
       <w:pgSz w:w="11906" w:h="16838"/>
       <w:pgMar w:top="720" w:right="720" w:bottom="720" w:left="720" w:header="708" w:footer="708" w:gutter="0"/>
@@ -3924,15 +3734,17 @@
   <w:docDefaults>
     <w:rPrDefault>
       <w:rPr>
-        <w:rFonts w:ascii="Calibri" w:eastAsia="Calibri" w:hAnsi="Calibri" w:cs="Calibri"/>
-        <w:sz w:val="22"/>
-        <w:szCs w:val="22"/>
-        <w:lang w:val="en-GB" w:eastAsia="en-GB" w:bidi="ar-SA"/>
+        <w:rFonts w:asciiTheme="minorHAnsi" w:eastAsiaTheme="minorHAnsi" w:hAnsiTheme="minorHAnsi" w:cstheme="minorBidi"/>
+        <w:kern w:val="2"/>
+        <w:sz w:val="24"/>
+        <w:szCs w:val="24"/>
+        <w:lang w:val="en-GB" w:eastAsia="en-US" w:bidi="ar-SA"/>
+        <w14:ligatures w14:val="standardContextual"/>
       </w:rPr>
     </w:rPrDefault>
     <w:pPrDefault>
       <w:pPr>
-        <w:spacing w:after="160" w:line="259" w:lineRule="auto"/>
+        <w:spacing w:after="160" w:line="278" w:lineRule="auto"/>
       </w:pPr>
     </w:pPrDefault>
   </w:docDefaults>
@@ -4317,121 +4129,255 @@
   <w:style w:type="paragraph" w:default="1" w:styleId="Normal">
     <w:name w:val="Normal"/>
     <w:qFormat/>
+    <w:rsid w:val="00523558"/>
+    <w:pPr>
+      <w:spacing w:line="259" w:lineRule="auto"/>
+    </w:pPr>
+    <w:rPr>
+      <w:rFonts w:ascii="Calibri" w:eastAsia="Calibri" w:hAnsi="Calibri" w:cs="Calibri"/>
+      <w:kern w:val="0"/>
+      <w:sz w:val="22"/>
+      <w:szCs w:val="22"/>
+      <w:lang w:eastAsia="en-GB"/>
+      <w14:ligatures w14:val="none"/>
+    </w:rPr>
   </w:style>
   <w:style w:type="paragraph" w:styleId="Heading1">
     <w:name w:val="heading 1"/>
     <w:basedOn w:val="Normal"/>
     <w:next w:val="Normal"/>
+    <w:link w:val="Heading1Char"/>
     <w:uiPriority w:val="9"/>
     <w:qFormat/>
+    <w:rsid w:val="00523558"/>
     <w:pPr>
       <w:keepNext/>
       <w:keepLines/>
-      <w:spacing w:before="480" w:after="120"/>
+      <w:spacing w:before="360" w:after="80" w:line="278" w:lineRule="auto"/>
       <w:outlineLvl w:val="0"/>
     </w:pPr>
     <w:rPr>
-      <w:b/>
-      <w:sz w:val="48"/>
-      <w:szCs w:val="48"/>
+      <w:rFonts w:asciiTheme="majorHAnsi" w:eastAsiaTheme="majorEastAsia" w:hAnsiTheme="majorHAnsi" w:cstheme="majorBidi"/>
+      <w:color w:val="0F4761" w:themeColor="accent1" w:themeShade="BF"/>
+      <w:kern w:val="2"/>
+      <w:sz w:val="40"/>
+      <w:szCs w:val="40"/>
+      <w:lang w:eastAsia="en-US"/>
+      <w14:ligatures w14:val="standardContextual"/>
     </w:rPr>
   </w:style>
   <w:style w:type="paragraph" w:styleId="Heading2">
     <w:name w:val="heading 2"/>
     <w:basedOn w:val="Normal"/>
     <w:next w:val="Normal"/>
+    <w:link w:val="Heading2Char"/>
     <w:uiPriority w:val="9"/>
     <w:semiHidden/>
     <w:unhideWhenUsed/>
     <w:qFormat/>
+    <w:rsid w:val="00523558"/>
     <w:pPr>
       <w:keepNext/>
       <w:keepLines/>
-      <w:spacing w:before="360" w:after="80"/>
+      <w:spacing w:before="160" w:after="80" w:line="278" w:lineRule="auto"/>
       <w:outlineLvl w:val="1"/>
     </w:pPr>
     <w:rPr>
-      <w:b/>
-      <w:sz w:val="36"/>
-      <w:szCs w:val="36"/>
+      <w:rFonts w:asciiTheme="majorHAnsi" w:eastAsiaTheme="majorEastAsia" w:hAnsiTheme="majorHAnsi" w:cstheme="majorBidi"/>
+      <w:color w:val="0F4761" w:themeColor="accent1" w:themeShade="BF"/>
+      <w:kern w:val="2"/>
+      <w:sz w:val="32"/>
+      <w:szCs w:val="32"/>
+      <w:lang w:eastAsia="en-US"/>
+      <w14:ligatures w14:val="standardContextual"/>
     </w:rPr>
   </w:style>
   <w:style w:type="paragraph" w:styleId="Heading3">
     <w:name w:val="heading 3"/>
     <w:basedOn w:val="Normal"/>
     <w:next w:val="Normal"/>
+    <w:link w:val="Heading3Char"/>
     <w:uiPriority w:val="9"/>
     <w:semiHidden/>
     <w:unhideWhenUsed/>
     <w:qFormat/>
+    <w:rsid w:val="00523558"/>
     <w:pPr>
       <w:keepNext/>
       <w:keepLines/>
-      <w:spacing w:before="280" w:after="80"/>
+      <w:spacing w:before="160" w:after="80" w:line="278" w:lineRule="auto"/>
       <w:outlineLvl w:val="2"/>
     </w:pPr>
     <w:rPr>
-      <w:b/>
+      <w:rFonts w:asciiTheme="minorHAnsi" w:eastAsiaTheme="majorEastAsia" w:hAnsiTheme="minorHAnsi" w:cstheme="majorBidi"/>
+      <w:color w:val="0F4761" w:themeColor="accent1" w:themeShade="BF"/>
+      <w:kern w:val="2"/>
       <w:sz w:val="28"/>
       <w:szCs w:val="28"/>
+      <w:lang w:eastAsia="en-US"/>
+      <w14:ligatures w14:val="standardContextual"/>
     </w:rPr>
   </w:style>
   <w:style w:type="paragraph" w:styleId="Heading4">
     <w:name w:val="heading 4"/>
     <w:basedOn w:val="Normal"/>
     <w:next w:val="Normal"/>
+    <w:link w:val="Heading4Char"/>
     <w:uiPriority w:val="9"/>
     <w:semiHidden/>
     <w:unhideWhenUsed/>
     <w:qFormat/>
+    <w:rsid w:val="00523558"/>
     <w:pPr>
       <w:keepNext/>
       <w:keepLines/>
-      <w:spacing w:before="240" w:after="40"/>
+      <w:spacing w:before="80" w:after="40" w:line="278" w:lineRule="auto"/>
       <w:outlineLvl w:val="3"/>
     </w:pPr>
     <w:rPr>
-      <w:b/>
+      <w:rFonts w:asciiTheme="minorHAnsi" w:eastAsiaTheme="majorEastAsia" w:hAnsiTheme="minorHAnsi" w:cstheme="majorBidi"/>
+      <w:i/>
+      <w:iCs/>
+      <w:color w:val="0F4761" w:themeColor="accent1" w:themeShade="BF"/>
+      <w:kern w:val="2"/>
       <w:sz w:val="24"/>
       <w:szCs w:val="24"/>
+      <w:lang w:eastAsia="en-US"/>
+      <w14:ligatures w14:val="standardContextual"/>
     </w:rPr>
   </w:style>
   <w:style w:type="paragraph" w:styleId="Heading5">
     <w:name w:val="heading 5"/>
     <w:basedOn w:val="Normal"/>
     <w:next w:val="Normal"/>
+    <w:link w:val="Heading5Char"/>
     <w:uiPriority w:val="9"/>
     <w:semiHidden/>
     <w:unhideWhenUsed/>
     <w:qFormat/>
+    <w:rsid w:val="00523558"/>
     <w:pPr>
       <w:keepNext/>
       <w:keepLines/>
-      <w:spacing w:before="220" w:after="40"/>
+      <w:spacing w:before="80" w:after="40" w:line="278" w:lineRule="auto"/>
       <w:outlineLvl w:val="4"/>
     </w:pPr>
     <w:rPr>
-      <w:b/>
+      <w:rFonts w:asciiTheme="minorHAnsi" w:eastAsiaTheme="majorEastAsia" w:hAnsiTheme="minorHAnsi" w:cstheme="majorBidi"/>
+      <w:color w:val="0F4761" w:themeColor="accent1" w:themeShade="BF"/>
+      <w:kern w:val="2"/>
+      <w:sz w:val="24"/>
+      <w:szCs w:val="24"/>
+      <w:lang w:eastAsia="en-US"/>
+      <w14:ligatures w14:val="standardContextual"/>
     </w:rPr>
   </w:style>
   <w:style w:type="paragraph" w:styleId="Heading6">
     <w:name w:val="heading 6"/>
     <w:basedOn w:val="Normal"/>
     <w:next w:val="Normal"/>
+    <w:link w:val="Heading6Char"/>
     <w:uiPriority w:val="9"/>
     <w:semiHidden/>
     <w:unhideWhenUsed/>
     <w:qFormat/>
+    <w:rsid w:val="00523558"/>
     <w:pPr>
       <w:keepNext/>
       <w:keepLines/>
-      <w:spacing w:before="200" w:after="40"/>
+      <w:spacing w:before="40" w:after="0" w:line="278" w:lineRule="auto"/>
       <w:outlineLvl w:val="5"/>
     </w:pPr>
     <w:rPr>
-      <w:b/>
-      <w:sz w:val="20"/>
-      <w:szCs w:val="20"/>
+      <w:rFonts w:asciiTheme="minorHAnsi" w:eastAsiaTheme="majorEastAsia" w:hAnsiTheme="minorHAnsi" w:cstheme="majorBidi"/>
+      <w:i/>
+      <w:iCs/>
+      <w:color w:val="595959" w:themeColor="text1" w:themeTint="A6"/>
+      <w:kern w:val="2"/>
+      <w:sz w:val="24"/>
+      <w:szCs w:val="24"/>
+      <w:lang w:eastAsia="en-US"/>
+      <w14:ligatures w14:val="standardContextual"/>
+    </w:rPr>
+  </w:style>
+  <w:style w:type="paragraph" w:styleId="Heading7">
+    <w:name w:val="heading 7"/>
+    <w:basedOn w:val="Normal"/>
+    <w:next w:val="Normal"/>
+    <w:link w:val="Heading7Char"/>
+    <w:uiPriority w:val="9"/>
+    <w:semiHidden/>
+    <w:unhideWhenUsed/>
+    <w:qFormat/>
+    <w:rsid w:val="00523558"/>
+    <w:pPr>
+      <w:keepNext/>
+      <w:keepLines/>
+      <w:spacing w:before="40" w:after="0" w:line="278" w:lineRule="auto"/>
+      <w:outlineLvl w:val="6"/>
+    </w:pPr>
+    <w:rPr>
+      <w:rFonts w:asciiTheme="minorHAnsi" w:eastAsiaTheme="majorEastAsia" w:hAnsiTheme="minorHAnsi" w:cstheme="majorBidi"/>
+      <w:color w:val="595959" w:themeColor="text1" w:themeTint="A6"/>
+      <w:kern w:val="2"/>
+      <w:sz w:val="24"/>
+      <w:szCs w:val="24"/>
+      <w:lang w:eastAsia="en-US"/>
+      <w14:ligatures w14:val="standardContextual"/>
+    </w:rPr>
+  </w:style>
+  <w:style w:type="paragraph" w:styleId="Heading8">
+    <w:name w:val="heading 8"/>
+    <w:basedOn w:val="Normal"/>
+    <w:next w:val="Normal"/>
+    <w:link w:val="Heading8Char"/>
+    <w:uiPriority w:val="9"/>
+    <w:semiHidden/>
+    <w:unhideWhenUsed/>
+    <w:qFormat/>
+    <w:rsid w:val="00523558"/>
+    <w:pPr>
+      <w:keepNext/>
+      <w:keepLines/>
+      <w:spacing w:after="0" w:line="278" w:lineRule="auto"/>
+      <w:outlineLvl w:val="7"/>
+    </w:pPr>
+    <w:rPr>
+      <w:rFonts w:asciiTheme="minorHAnsi" w:eastAsiaTheme="majorEastAsia" w:hAnsiTheme="minorHAnsi" w:cstheme="majorBidi"/>
+      <w:i/>
+      <w:iCs/>
+      <w:color w:val="272727" w:themeColor="text1" w:themeTint="D8"/>
+      <w:kern w:val="2"/>
+      <w:sz w:val="24"/>
+      <w:szCs w:val="24"/>
+      <w:lang w:eastAsia="en-US"/>
+      <w14:ligatures w14:val="standardContextual"/>
+    </w:rPr>
+  </w:style>
+  <w:style w:type="paragraph" w:styleId="Heading9">
+    <w:name w:val="heading 9"/>
+    <w:basedOn w:val="Normal"/>
+    <w:next w:val="Normal"/>
+    <w:link w:val="Heading9Char"/>
+    <w:uiPriority w:val="9"/>
+    <w:semiHidden/>
+    <w:unhideWhenUsed/>
+    <w:qFormat/>
+    <w:rsid w:val="00523558"/>
+    <w:pPr>
+      <w:keepNext/>
+      <w:keepLines/>
+      <w:spacing w:after="0" w:line="278" w:lineRule="auto"/>
+      <w:outlineLvl w:val="8"/>
+    </w:pPr>
+    <w:rPr>
+      <w:rFonts w:asciiTheme="minorHAnsi" w:eastAsiaTheme="majorEastAsia" w:hAnsiTheme="minorHAnsi" w:cstheme="majorBidi"/>
+      <w:color w:val="272727" w:themeColor="text1" w:themeTint="D8"/>
+      <w:kern w:val="2"/>
+      <w:sz w:val="24"/>
+      <w:szCs w:val="24"/>
+      <w:lang w:eastAsia="en-US"/>
+      <w14:ligatures w14:val="standardContextual"/>
     </w:rPr>
   </w:style>
   <w:style w:type="character" w:default="1" w:styleId="DefaultParagraphFont">
@@ -4461,111 +4407,322 @@
     <w:semiHidden/>
     <w:unhideWhenUsed/>
   </w:style>
+  <w:style w:type="character" w:customStyle="1" w:styleId="Heading1Char">
+    <w:name w:val="Heading 1 Char"/>
+    <w:basedOn w:val="DefaultParagraphFont"/>
+    <w:link w:val="Heading1"/>
+    <w:uiPriority w:val="9"/>
+    <w:rsid w:val="00523558"/>
+    <w:rPr>
+      <w:rFonts w:asciiTheme="majorHAnsi" w:eastAsiaTheme="majorEastAsia" w:hAnsiTheme="majorHAnsi" w:cstheme="majorBidi"/>
+      <w:color w:val="0F4761" w:themeColor="accent1" w:themeShade="BF"/>
+      <w:sz w:val="40"/>
+      <w:szCs w:val="40"/>
+    </w:rPr>
+  </w:style>
+  <w:style w:type="character" w:customStyle="1" w:styleId="Heading2Char">
+    <w:name w:val="Heading 2 Char"/>
+    <w:basedOn w:val="DefaultParagraphFont"/>
+    <w:link w:val="Heading2"/>
+    <w:uiPriority w:val="9"/>
+    <w:semiHidden/>
+    <w:rsid w:val="00523558"/>
+    <w:rPr>
+      <w:rFonts w:asciiTheme="majorHAnsi" w:eastAsiaTheme="majorEastAsia" w:hAnsiTheme="majorHAnsi" w:cstheme="majorBidi"/>
+      <w:color w:val="0F4761" w:themeColor="accent1" w:themeShade="BF"/>
+      <w:sz w:val="32"/>
+      <w:szCs w:val="32"/>
+    </w:rPr>
+  </w:style>
+  <w:style w:type="character" w:customStyle="1" w:styleId="Heading3Char">
+    <w:name w:val="Heading 3 Char"/>
+    <w:basedOn w:val="DefaultParagraphFont"/>
+    <w:link w:val="Heading3"/>
+    <w:uiPriority w:val="9"/>
+    <w:semiHidden/>
+    <w:rsid w:val="00523558"/>
+    <w:rPr>
+      <w:rFonts w:eastAsiaTheme="majorEastAsia" w:cstheme="majorBidi"/>
+      <w:color w:val="0F4761" w:themeColor="accent1" w:themeShade="BF"/>
+      <w:sz w:val="28"/>
+      <w:szCs w:val="28"/>
+    </w:rPr>
+  </w:style>
+  <w:style w:type="character" w:customStyle="1" w:styleId="Heading4Char">
+    <w:name w:val="Heading 4 Char"/>
+    <w:basedOn w:val="DefaultParagraphFont"/>
+    <w:link w:val="Heading4"/>
+    <w:uiPriority w:val="9"/>
+    <w:semiHidden/>
+    <w:rsid w:val="00523558"/>
+    <w:rPr>
+      <w:rFonts w:eastAsiaTheme="majorEastAsia" w:cstheme="majorBidi"/>
+      <w:i/>
+      <w:iCs/>
+      <w:color w:val="0F4761" w:themeColor="accent1" w:themeShade="BF"/>
+    </w:rPr>
+  </w:style>
+  <w:style w:type="character" w:customStyle="1" w:styleId="Heading5Char">
+    <w:name w:val="Heading 5 Char"/>
+    <w:basedOn w:val="DefaultParagraphFont"/>
+    <w:link w:val="Heading5"/>
+    <w:uiPriority w:val="9"/>
+    <w:semiHidden/>
+    <w:rsid w:val="00523558"/>
+    <w:rPr>
+      <w:rFonts w:eastAsiaTheme="majorEastAsia" w:cstheme="majorBidi"/>
+      <w:color w:val="0F4761" w:themeColor="accent1" w:themeShade="BF"/>
+    </w:rPr>
+  </w:style>
+  <w:style w:type="character" w:customStyle="1" w:styleId="Heading6Char">
+    <w:name w:val="Heading 6 Char"/>
+    <w:basedOn w:val="DefaultParagraphFont"/>
+    <w:link w:val="Heading6"/>
+    <w:uiPriority w:val="9"/>
+    <w:semiHidden/>
+    <w:rsid w:val="00523558"/>
+    <w:rPr>
+      <w:rFonts w:eastAsiaTheme="majorEastAsia" w:cstheme="majorBidi"/>
+      <w:i/>
+      <w:iCs/>
+      <w:color w:val="595959" w:themeColor="text1" w:themeTint="A6"/>
+    </w:rPr>
+  </w:style>
+  <w:style w:type="character" w:customStyle="1" w:styleId="Heading7Char">
+    <w:name w:val="Heading 7 Char"/>
+    <w:basedOn w:val="DefaultParagraphFont"/>
+    <w:link w:val="Heading7"/>
+    <w:uiPriority w:val="9"/>
+    <w:semiHidden/>
+    <w:rsid w:val="00523558"/>
+    <w:rPr>
+      <w:rFonts w:eastAsiaTheme="majorEastAsia" w:cstheme="majorBidi"/>
+      <w:color w:val="595959" w:themeColor="text1" w:themeTint="A6"/>
+    </w:rPr>
+  </w:style>
+  <w:style w:type="character" w:customStyle="1" w:styleId="Heading8Char">
+    <w:name w:val="Heading 8 Char"/>
+    <w:basedOn w:val="DefaultParagraphFont"/>
+    <w:link w:val="Heading8"/>
+    <w:uiPriority w:val="9"/>
+    <w:semiHidden/>
+    <w:rsid w:val="00523558"/>
+    <w:rPr>
+      <w:rFonts w:eastAsiaTheme="majorEastAsia" w:cstheme="majorBidi"/>
+      <w:i/>
+      <w:iCs/>
+      <w:color w:val="272727" w:themeColor="text1" w:themeTint="D8"/>
+    </w:rPr>
+  </w:style>
+  <w:style w:type="character" w:customStyle="1" w:styleId="Heading9Char">
+    <w:name w:val="Heading 9 Char"/>
+    <w:basedOn w:val="DefaultParagraphFont"/>
+    <w:link w:val="Heading9"/>
+    <w:uiPriority w:val="9"/>
+    <w:semiHidden/>
+    <w:rsid w:val="00523558"/>
+    <w:rPr>
+      <w:rFonts w:eastAsiaTheme="majorEastAsia" w:cstheme="majorBidi"/>
+      <w:color w:val="272727" w:themeColor="text1" w:themeTint="D8"/>
+    </w:rPr>
+  </w:style>
   <w:style w:type="paragraph" w:styleId="Title">
     <w:name w:val="Title"/>
     <w:basedOn w:val="Normal"/>
     <w:next w:val="Normal"/>
+    <w:link w:val="TitleChar"/>
     <w:uiPriority w:val="10"/>
     <w:qFormat/>
+    <w:rsid w:val="00523558"/>
     <w:pPr>
-      <w:keepNext/>
-      <w:keepLines/>
-      <w:spacing w:before="480" w:after="120"/>
+      <w:spacing w:after="80" w:line="240" w:lineRule="auto"/>
+      <w:contextualSpacing/>
     </w:pPr>
     <w:rPr>
-      <w:b/>
-      <w:sz w:val="72"/>
-      <w:szCs w:val="72"/>
+      <w:rFonts w:asciiTheme="majorHAnsi" w:eastAsiaTheme="majorEastAsia" w:hAnsiTheme="majorHAnsi" w:cstheme="majorBidi"/>
+      <w:spacing w:val="-10"/>
+      <w:kern w:val="28"/>
+      <w:sz w:val="56"/>
+      <w:szCs w:val="56"/>
+      <w:lang w:eastAsia="en-US"/>
+      <w14:ligatures w14:val="standardContextual"/>
     </w:rPr>
   </w:style>
-  <w:style w:type="character" w:styleId="Hyperlink">
-    <w:name w:val="Hyperlink"/>
+  <w:style w:type="character" w:customStyle="1" w:styleId="TitleChar">
+    <w:name w:val="Title Char"/>
     <w:basedOn w:val="DefaultParagraphFont"/>
-    <w:uiPriority w:val="99"/>
-    <w:unhideWhenUsed/>
-    <w:rsid w:val="007A3B8E"/>
+    <w:link w:val="Title"/>
+    <w:uiPriority w:val="10"/>
+    <w:rsid w:val="00523558"/>
     <w:rPr>
-      <w:color w:val="0563C1" w:themeColor="hyperlink"/>
-      <w:u w:val="single"/>
+      <w:rFonts w:asciiTheme="majorHAnsi" w:eastAsiaTheme="majorEastAsia" w:hAnsiTheme="majorHAnsi" w:cstheme="majorBidi"/>
+      <w:spacing w:val="-10"/>
+      <w:kern w:val="28"/>
+      <w:sz w:val="56"/>
+      <w:szCs w:val="56"/>
     </w:rPr>
-  </w:style>
-  <w:style w:type="paragraph" w:styleId="BalloonText">
-    <w:name w:val="Balloon Text"/>
-    <w:basedOn w:val="Normal"/>
-    <w:link w:val="BalloonTextChar"/>
-    <w:uiPriority w:val="99"/>
-    <w:semiHidden/>
-    <w:unhideWhenUsed/>
-    <w:rsid w:val="00833804"/>
-    <w:pPr>
-      <w:spacing w:after="0" w:line="240" w:lineRule="auto"/>
-    </w:pPr>
-    <w:rPr>
-      <w:rFonts w:ascii="Segoe UI" w:hAnsi="Segoe UI" w:cs="Segoe UI"/>
-      <w:sz w:val="18"/>
-      <w:szCs w:val="18"/>
-    </w:rPr>
-  </w:style>
-  <w:style w:type="character" w:customStyle="1" w:styleId="BalloonTextChar">
-    <w:name w:val="Balloon Text Char"/>
-    <w:basedOn w:val="DefaultParagraphFont"/>
-    <w:link w:val="BalloonText"/>
-    <w:uiPriority w:val="99"/>
-    <w:semiHidden/>
-    <w:rsid w:val="00833804"/>
-    <w:rPr>
-      <w:rFonts w:ascii="Segoe UI" w:hAnsi="Segoe UI" w:cs="Segoe UI"/>
-      <w:sz w:val="18"/>
-      <w:szCs w:val="18"/>
-    </w:rPr>
-  </w:style>
-  <w:style w:type="table" w:styleId="TableGrid">
-    <w:name w:val="Table Grid"/>
-    <w:basedOn w:val="TableNormal"/>
-    <w:uiPriority w:val="39"/>
-    <w:rsid w:val="00BF3CB0"/>
-    <w:pPr>
-      <w:spacing w:after="0" w:line="240" w:lineRule="auto"/>
-    </w:pPr>
-    <w:tblPr>
-      <w:tblBorders>
-        <w:top w:val="single" w:sz="4" w:space="0" w:color="auto"/>
-        <w:left w:val="single" w:sz="4" w:space="0" w:color="auto"/>
-        <w:bottom w:val="single" w:sz="4" w:space="0" w:color="auto"/>
-        <w:right w:val="single" w:sz="4" w:space="0" w:color="auto"/>
-        <w:insideH w:val="single" w:sz="4" w:space="0" w:color="auto"/>
-        <w:insideV w:val="single" w:sz="4" w:space="0" w:color="auto"/>
-      </w:tblBorders>
-    </w:tblPr>
   </w:style>
   <w:style w:type="paragraph" w:styleId="Subtitle">
     <w:name w:val="Subtitle"/>
     <w:basedOn w:val="Normal"/>
     <w:next w:val="Normal"/>
+    <w:link w:val="SubtitleChar"/>
     <w:uiPriority w:val="11"/>
     <w:qFormat/>
+    <w:rsid w:val="00523558"/>
     <w:pPr>
-      <w:keepNext/>
-      <w:keepLines/>
-      <w:spacing w:before="360" w:after="80"/>
+      <w:numPr>
+        <w:ilvl w:val="1"/>
+      </w:numPr>
+      <w:spacing w:line="278" w:lineRule="auto"/>
     </w:pPr>
     <w:rPr>
-      <w:rFonts w:ascii="Georgia" w:eastAsia="Georgia" w:hAnsi="Georgia" w:cs="Georgia"/>
-      <w:i/>
-      <w:color w:val="666666"/>
-      <w:sz w:val="48"/>
-      <w:szCs w:val="48"/>
+      <w:rFonts w:asciiTheme="minorHAnsi" w:eastAsiaTheme="majorEastAsia" w:hAnsiTheme="minorHAnsi" w:cstheme="majorBidi"/>
+      <w:color w:val="595959" w:themeColor="text1" w:themeTint="A6"/>
+      <w:spacing w:val="15"/>
+      <w:kern w:val="2"/>
+      <w:sz w:val="28"/>
+      <w:szCs w:val="28"/>
+      <w:lang w:eastAsia="en-US"/>
+      <w14:ligatures w14:val="standardContextual"/>
     </w:rPr>
   </w:style>
-  <w:style w:type="table" w:customStyle="1" w:styleId="a">
-    <w:basedOn w:val="TableNormal"/>
+  <w:style w:type="character" w:customStyle="1" w:styleId="SubtitleChar">
+    <w:name w:val="Subtitle Char"/>
+    <w:basedOn w:val="DefaultParagraphFont"/>
+    <w:link w:val="Subtitle"/>
+    <w:uiPriority w:val="11"/>
+    <w:rsid w:val="00523558"/>
+    <w:rPr>
+      <w:rFonts w:eastAsiaTheme="majorEastAsia" w:cstheme="majorBidi"/>
+      <w:color w:val="595959" w:themeColor="text1" w:themeTint="A6"/>
+      <w:spacing w:val="15"/>
+      <w:sz w:val="28"/>
+      <w:szCs w:val="28"/>
+    </w:rPr>
+  </w:style>
+  <w:style w:type="paragraph" w:styleId="Quote">
+    <w:name w:val="Quote"/>
+    <w:basedOn w:val="Normal"/>
+    <w:next w:val="Normal"/>
+    <w:link w:val="QuoteChar"/>
+    <w:uiPriority w:val="29"/>
+    <w:qFormat/>
+    <w:rsid w:val="00523558"/>
     <w:pPr>
-      <w:spacing w:after="0" w:line="240" w:lineRule="auto"/>
+      <w:spacing w:before="160" w:line="278" w:lineRule="auto"/>
+      <w:jc w:val="center"/>
     </w:pPr>
-    <w:tblPr>
-      <w:tblStyleRowBandSize w:val="1"/>
-      <w:tblStyleColBandSize w:val="1"/>
-    </w:tblPr>
+    <w:rPr>
+      <w:rFonts w:asciiTheme="minorHAnsi" w:eastAsiaTheme="minorHAnsi" w:hAnsiTheme="minorHAnsi" w:cstheme="minorBidi"/>
+      <w:i/>
+      <w:iCs/>
+      <w:color w:val="404040" w:themeColor="text1" w:themeTint="BF"/>
+      <w:kern w:val="2"/>
+      <w:sz w:val="24"/>
+      <w:szCs w:val="24"/>
+      <w:lang w:eastAsia="en-US"/>
+      <w14:ligatures w14:val="standardContextual"/>
+    </w:rPr>
+  </w:style>
+  <w:style w:type="character" w:customStyle="1" w:styleId="QuoteChar">
+    <w:name w:val="Quote Char"/>
+    <w:basedOn w:val="DefaultParagraphFont"/>
+    <w:link w:val="Quote"/>
+    <w:uiPriority w:val="29"/>
+    <w:rsid w:val="00523558"/>
+    <w:rPr>
+      <w:i/>
+      <w:iCs/>
+      <w:color w:val="404040" w:themeColor="text1" w:themeTint="BF"/>
+    </w:rPr>
+  </w:style>
+  <w:style w:type="paragraph" w:styleId="ListParagraph">
+    <w:name w:val="List Paragraph"/>
+    <w:basedOn w:val="Normal"/>
+    <w:uiPriority w:val="34"/>
+    <w:qFormat/>
+    <w:rsid w:val="00523558"/>
+    <w:pPr>
+      <w:spacing w:line="278" w:lineRule="auto"/>
+      <w:ind w:left="720"/>
+      <w:contextualSpacing/>
+    </w:pPr>
+    <w:rPr>
+      <w:rFonts w:asciiTheme="minorHAnsi" w:eastAsiaTheme="minorHAnsi" w:hAnsiTheme="minorHAnsi" w:cstheme="minorBidi"/>
+      <w:kern w:val="2"/>
+      <w:sz w:val="24"/>
+      <w:szCs w:val="24"/>
+      <w:lang w:eastAsia="en-US"/>
+      <w14:ligatures w14:val="standardContextual"/>
+    </w:rPr>
+  </w:style>
+  <w:style w:type="character" w:styleId="IntenseEmphasis">
+    <w:name w:val="Intense Emphasis"/>
+    <w:basedOn w:val="DefaultParagraphFont"/>
+    <w:uiPriority w:val="21"/>
+    <w:qFormat/>
+    <w:rsid w:val="00523558"/>
+    <w:rPr>
+      <w:i/>
+      <w:iCs/>
+      <w:color w:val="0F4761" w:themeColor="accent1" w:themeShade="BF"/>
+    </w:rPr>
+  </w:style>
+  <w:style w:type="paragraph" w:styleId="IntenseQuote">
+    <w:name w:val="Intense Quote"/>
+    <w:basedOn w:val="Normal"/>
+    <w:next w:val="Normal"/>
+    <w:link w:val="IntenseQuoteChar"/>
+    <w:uiPriority w:val="30"/>
+    <w:qFormat/>
+    <w:rsid w:val="00523558"/>
+    <w:pPr>
+      <w:pBdr>
+        <w:top w:val="single" w:sz="4" w:space="10" w:color="0F4761" w:themeColor="accent1" w:themeShade="BF"/>
+        <w:bottom w:val="single" w:sz="4" w:space="10" w:color="0F4761" w:themeColor="accent1" w:themeShade="BF"/>
+      </w:pBdr>
+      <w:spacing w:before="360" w:after="360" w:line="278" w:lineRule="auto"/>
+      <w:ind w:left="864" w:right="864"/>
+      <w:jc w:val="center"/>
+    </w:pPr>
+    <w:rPr>
+      <w:rFonts w:asciiTheme="minorHAnsi" w:eastAsiaTheme="minorHAnsi" w:hAnsiTheme="minorHAnsi" w:cstheme="minorBidi"/>
+      <w:i/>
+      <w:iCs/>
+      <w:color w:val="0F4761" w:themeColor="accent1" w:themeShade="BF"/>
+      <w:kern w:val="2"/>
+      <w:sz w:val="24"/>
+      <w:szCs w:val="24"/>
+      <w:lang w:eastAsia="en-US"/>
+      <w14:ligatures w14:val="standardContextual"/>
+    </w:rPr>
+  </w:style>
+  <w:style w:type="character" w:customStyle="1" w:styleId="IntenseQuoteChar">
+    <w:name w:val="Intense Quote Char"/>
+    <w:basedOn w:val="DefaultParagraphFont"/>
+    <w:link w:val="IntenseQuote"/>
+    <w:uiPriority w:val="30"/>
+    <w:rsid w:val="00523558"/>
+    <w:rPr>
+      <w:i/>
+      <w:iCs/>
+      <w:color w:val="0F4761" w:themeColor="accent1" w:themeShade="BF"/>
+    </w:rPr>
+  </w:style>
+  <w:style w:type="character" w:styleId="IntenseReference">
+    <w:name w:val="Intense Reference"/>
+    <w:basedOn w:val="DefaultParagraphFont"/>
+    <w:uiPriority w:val="32"/>
+    <w:qFormat/>
+    <w:rsid w:val="00523558"/>
+    <w:rPr>
+      <w:b/>
+      <w:bCs/>
+      <w:smallCaps/>
+      <w:color w:val="0F4761" w:themeColor="accent1" w:themeShade="BF"/>
+      <w:spacing w:val="5"/>
+    </w:rPr>
   </w:style>
 </w:styles>
 </file>
@@ -4581,44 +4738,44 @@
         <a:sysClr val="window" lastClr="FFFFFF"/>
       </a:lt1>
       <a:dk2>
-        <a:srgbClr val="44546A"/>
+        <a:srgbClr val="0E2841"/>
       </a:dk2>
       <a:lt2>
-        <a:srgbClr val="E7E6E6"/>
+        <a:srgbClr val="E8E8E8"/>
       </a:lt2>
       <a:accent1>
-        <a:srgbClr val="5B9BD5"/>
+        <a:srgbClr val="156082"/>
       </a:accent1>
       <a:accent2>
-        <a:srgbClr val="ED7D31"/>
+        <a:srgbClr val="E97132"/>
       </a:accent2>
       <a:accent3>
-        <a:srgbClr val="A5A5A5"/>
+        <a:srgbClr val="196B24"/>
       </a:accent3>
       <a:accent4>
-        <a:srgbClr val="FFC000"/>
+        <a:srgbClr val="0F9ED5"/>
       </a:accent4>
       <a:accent5>
-        <a:srgbClr val="4472C4"/>
+        <a:srgbClr val="A02B93"/>
       </a:accent5>
       <a:accent6>
-        <a:srgbClr val="70AD47"/>
+        <a:srgbClr val="4EA72E"/>
       </a:accent6>
       <a:hlink>
-        <a:srgbClr val="0563C1"/>
+        <a:srgbClr val="467886"/>
       </a:hlink>
       <a:folHlink>
-        <a:srgbClr val="954F72"/>
+        <a:srgbClr val="96607D"/>
       </a:folHlink>
     </a:clrScheme>
     <a:fontScheme name="Office">
       <a:majorFont>
-        <a:latin typeface="Calibri Light" panose="020F0302020204030204"/>
+        <a:latin typeface="Aptos Display" panose="02110004020202020204"/>
         <a:ea typeface=""/>
         <a:cs typeface=""/>
-        <a:font script="Jpan" typeface="ＭＳ ゴシック"/>
+        <a:font script="Jpan" typeface="游ゴシック Light"/>
         <a:font script="Hang" typeface="맑은 고딕"/>
-        <a:font script="Hans" typeface="宋体"/>
+        <a:font script="Hans" typeface="等线 Light"/>
         <a:font script="Hant" typeface="新細明體"/>
         <a:font script="Arab" typeface="Times New Roman"/>
         <a:font script="Hebr" typeface="Times New Roman"/>
@@ -4646,14 +4803,31 @@
         <a:font script="Viet" typeface="Times New Roman"/>
         <a:font script="Uigh" typeface="Microsoft Uighur"/>
         <a:font script="Geor" typeface="Sylfaen"/>
+        <a:font script="Armn" typeface="Arial"/>
+        <a:font script="Bugi" typeface="Leelawadee UI"/>
+        <a:font script="Bopo" typeface="Microsoft JhengHei"/>
+        <a:font script="Java" typeface="Javanese Text"/>
+        <a:font script="Lisu" typeface="Segoe UI"/>
+        <a:font script="Mymr" typeface="Myanmar Text"/>
+        <a:font script="Nkoo" typeface="Ebrima"/>
+        <a:font script="Olck" typeface="Nirmala UI"/>
+        <a:font script="Osma" typeface="Ebrima"/>
+        <a:font script="Phag" typeface="Phagspa"/>
+        <a:font script="Syrn" typeface="Estrangelo Edessa"/>
+        <a:font script="Syrj" typeface="Estrangelo Edessa"/>
+        <a:font script="Syre" typeface="Estrangelo Edessa"/>
+        <a:font script="Sora" typeface="Nirmala UI"/>
+        <a:font script="Tale" typeface="Microsoft Tai Le"/>
+        <a:font script="Talu" typeface="Microsoft New Tai Lue"/>
+        <a:font script="Tfng" typeface="Ebrima"/>
       </a:majorFont>
       <a:minorFont>
-        <a:latin typeface="Calibri" panose="020F0502020204030204"/>
+        <a:latin typeface="Aptos" panose="02110004020202020204"/>
         <a:ea typeface=""/>
         <a:cs typeface=""/>
-        <a:font script="Jpan" typeface="ＭＳ 明朝"/>
+        <a:font script="Jpan" typeface="游明朝"/>
         <a:font script="Hang" typeface="맑은 고딕"/>
-        <a:font script="Hans" typeface="宋体"/>
+        <a:font script="Hans" typeface="等线"/>
         <a:font script="Hant" typeface="新細明體"/>
         <a:font script="Arab" typeface="Arial"/>
         <a:font script="Hebr" typeface="Arial"/>
@@ -4681,6 +4855,23 @@
         <a:font script="Viet" typeface="Arial"/>
         <a:font script="Uigh" typeface="Microsoft Uighur"/>
         <a:font script="Geor" typeface="Sylfaen"/>
+        <a:font script="Armn" typeface="Arial"/>
+        <a:font script="Bugi" typeface="Leelawadee UI"/>
+        <a:font script="Bopo" typeface="Microsoft JhengHei"/>
+        <a:font script="Java" typeface="Javanese Text"/>
+        <a:font script="Lisu" typeface="Segoe UI"/>
+        <a:font script="Mymr" typeface="Myanmar Text"/>
+        <a:font script="Nkoo" typeface="Ebrima"/>
+        <a:font script="Olck" typeface="Nirmala UI"/>
+        <a:font script="Osma" typeface="Ebrima"/>
+        <a:font script="Phag" typeface="Phagspa"/>
+        <a:font script="Syrn" typeface="Estrangelo Edessa"/>
+        <a:font script="Syrj" typeface="Estrangelo Edessa"/>
+        <a:font script="Syre" typeface="Estrangelo Edessa"/>
+        <a:font script="Sora" typeface="Nirmala UI"/>
+        <a:font script="Tale" typeface="Microsoft Tai Le"/>
+        <a:font script="Talu" typeface="Microsoft New Tai Lue"/>
+        <a:font script="Tfng" typeface="Ebrima"/>
       </a:minorFont>
     </a:fontScheme>
     <a:fmtScheme name="Office">
@@ -4825,23 +5016,8 @@
   <a:extraClrSchemeLst/>
   <a:extLst>
     <a:ext uri="{05A4C25C-085E-4340-85A3-A5531E510DB2}">
-      <thm15:themeFamily xmlns:thm15="http://schemas.microsoft.com/office/thememl/2012/main" name="Office Theme" id="{62F939B6-93AF-4DB8-9C6B-D6C7DFDC589F}" vid="{4A3C46E8-61CC-4603-A589-7422A47A8E4A}"/>
+      <thm15:themeFamily xmlns:thm15="http://schemas.microsoft.com/office/thememl/2012/main" name="Office Theme" id="{2E142A2C-CD16-42D6-873A-C26D2A0506FA}" vid="{1BDDFF52-6CD6-40A5-AB3C-68EB2F1E4D0A}"/>
     </a:ext>
   </a:extLst>
 </a:theme>
-</file>
-
-<file path=customXml/item1.xml><?xml version="1.0" encoding="utf-8"?>
-<go:gDocsCustomXmlDataStorage xmlns:go="http://customooxmlschemas.google.com/" xmlns:r="http://schemas.openxmlformats.org/officeDocument/2006/relationships" uri="GoogleDocsCustomDataVersion2">
-  <go:docsCustomData xmlns:go="http://customooxmlschemas.google.com/" roundtripDataSignature="AMtx7miRkS7rXfU2c/q00xP8YQo0DuxrQw==">CgMxLjA4AHIhMTZ5bERraTJFLThnSTBLN0l5REEyYTRpLWNmbHAwa3VX</go:docsCustomData>
-</go:gDocsCustomXmlDataStorage>
-</file>
-
-<file path=customXml/itemProps1.xml><?xml version="1.0" encoding="utf-8"?>
-<ds:datastoreItem xmlns:ds="http://schemas.openxmlformats.org/officeDocument/2006/customXml" ds:itemID="{11111111-1234-1234-1234-123412341234}">
-  <ds:schemaRefs>
-    <ds:schemaRef ds:uri="http://customooxmlschemas.google.com/"/>
-    <ds:schemaRef ds:uri="http://schemas.openxmlformats.org/officeDocument/2006/relationships"/>
-  </ds:schemaRefs>
-</ds:datastoreItem>
 </file>
</xml_diff>